<commit_message>
Add backend docs and fix JPA model equality
</commit_message>
<xml_diff>
--- a/documentation/manuals/AthleticTrainerManual.docx
+++ b/documentation/manuals/AthleticTrainerManual.docx
@@ -32,7 +32,13 @@
       <w:bookmarkStart w:id="2" w:name="trainer-overview"/>
       <w:bookmarkEnd w:id="1"/>
       <w:r>
-        <w:t>1. Trainer Overview</w:t>
+        <w:t xml:space="preserve">1. </w:t>
+      </w:r>
+      <w:r>
+        <w:t xml:space="preserve">Athletic </w:t>
+      </w:r>
+      <w:r>
+        <w:t>Trainer Overview</w:t>
       </w:r>
     </w:p>
     <w:p>
@@ -244,8 +250,32 @@
         <w:pStyle w:val="FirstParagraph"/>
       </w:pPr>
       <w:r>
-        <w:t>After sign-in, check your profile or dashboard to confirm that GamePlan recognizes your trainer access.</w:t>
-      </w:r>
+        <w:t xml:space="preserve">After sign-in, check your profile or dashboard to confirm that </w:t>
+      </w:r>
+      <w:proofErr w:type="spellStart"/>
+      <w:r>
+        <w:t>GamePlan</w:t>
+      </w:r>
+      <w:proofErr w:type="spellEnd"/>
+      <w:r>
+        <w:t xml:space="preserve"> recognizes your</w:t>
+      </w:r>
+      <w:r>
+        <w:t xml:space="preserve"> athletic</w:t>
+      </w:r>
+      <w:r>
+        <w:t xml:space="preserve"> trainer access.</w:t>
+      </w:r>
+    </w:p>
+    <w:p>
+      <w:pPr>
+        <w:pStyle w:val="BodyText"/>
+      </w:pPr>
+    </w:p>
+    <w:p>
+      <w:pPr>
+        <w:pStyle w:val="BodyText"/>
+      </w:pPr>
     </w:p>
     <w:p>
       <w:r>
@@ -319,6 +349,9 @@
         </mc:AlternateContent>
       </w:r>
       <w:r>
+        <w:rPr>
+          <w:noProof/>
+        </w:rPr>
         <w:drawing>
           <wp:inline distT="0" distB="0" distL="0" distR="0" wp14:anchorId="46D0F6A9" wp14:editId="4D34F6D3">
             <wp:extent cx="4074695" cy="2407814"/>
@@ -665,7 +698,7 @@
           <w:noProof/>
         </w:rPr>
         <w:drawing>
-          <wp:inline distT="0" distB="0" distL="0" distR="0" wp14:anchorId="28CE3544" wp14:editId="4AB6BE61">
+          <wp:inline distT="0" distB="0" distL="0" distR="0" wp14:anchorId="28CE3544" wp14:editId="0A369BC0">
             <wp:extent cx="3352800" cy="1767552"/>
             <wp:effectExtent l="0" t="0" r="0" b="0"/>
             <wp:docPr id="590290340" name="Picture 12"/>
@@ -728,7 +761,10 @@
         <w:pStyle w:val="FirstParagraph"/>
       </w:pPr>
       <w:r>
-        <w:t>Trainer access includes a full reservation view for active bookings.</w:t>
+        <w:t>Athletic t</w:t>
+      </w:r>
+      <w:r>
+        <w:t>rainer access includes a full reservation view for active bookings.</w:t>
       </w:r>
     </w:p>
     <w:p>
@@ -855,7 +891,10 @@
         <w:pStyle w:val="FirstParagraph"/>
       </w:pPr>
       <w:r>
-        <w:t>Trainers can adjust reservation times when a change is needed.</w:t>
+        <w:t>Athletic tr</w:t>
+      </w:r>
+      <w:r>
+        <w:t>ainers can adjust reservation times when a change is needed.</w:t>
       </w:r>
     </w:p>
     <w:p>
@@ -1065,7 +1104,7 @@
           <w:noProof/>
         </w:rPr>
         <w:drawing>
-          <wp:inline distT="0" distB="0" distL="0" distR="0" wp14:anchorId="63CFD9E2" wp14:editId="371FC526">
+          <wp:inline distT="0" distB="0" distL="0" distR="0" wp14:anchorId="63CFD9E2" wp14:editId="2F347343">
             <wp:extent cx="6313714" cy="384488"/>
             <wp:effectExtent l="0" t="0" r="0" b="0"/>
             <wp:docPr id="75674100" name="Picture 15"/>
@@ -1142,7 +1181,13 @@
         <w:pStyle w:val="FirstParagraph"/>
       </w:pPr>
       <w:r>
-        <w:t>If a reservation must be removed, trainers can delete it from the reservation view.</w:t>
+        <w:t xml:space="preserve">If a reservation must be removed, </w:t>
+      </w:r>
+      <w:r>
+        <w:t xml:space="preserve">athletic </w:t>
+      </w:r>
+      <w:r>
+        <w:t>trainers can delete it from the reservation view.</w:t>
       </w:r>
     </w:p>
     <w:p>
@@ -1487,10 +1532,7 @@
         <w:pStyle w:val="Heading2"/>
       </w:pPr>
       <w:r>
-        <w:t>8</w:t>
-      </w:r>
-      <w:r>
-        <w:t>. Equipment Tools</w:t>
+        <w:t>8. Equipment Tools</w:t>
       </w:r>
     </w:p>
     <w:p>
@@ -1498,10 +1540,13 @@
         <w:pStyle w:val="FirstParagraph"/>
       </w:pPr>
       <w:r>
-        <w:t>As a trainer you can</w:t>
-      </w:r>
-      <w:r>
-        <w:t xml:space="preserve"> manage equipment and equipment types.</w:t>
+        <w:t>As a</w:t>
+      </w:r>
+      <w:r>
+        <w:t xml:space="preserve">n athletic trainer </w:t>
+      </w:r>
+      <w:r>
+        <w:t>you can manage equipment and equipment types.</w:t>
       </w:r>
     </w:p>
     <w:p>
@@ -1799,7 +1844,7 @@
           <w:noProof/>
         </w:rPr>
         <w:drawing>
-          <wp:inline distT="0" distB="0" distL="0" distR="0" wp14:anchorId="189BB9CC" wp14:editId="216AE089">
+          <wp:inline distT="0" distB="0" distL="0" distR="0" wp14:anchorId="189BB9CC" wp14:editId="025FC5D0">
             <wp:extent cx="3614057" cy="3127163"/>
             <wp:effectExtent l="0" t="0" r="0" b="0"/>
             <wp:docPr id="108435080" name="Picture 25"/>
@@ -2114,7 +2159,7 @@
           <w:noProof/>
         </w:rPr>
         <w:drawing>
-          <wp:inline distT="0" distB="0" distL="0" distR="0" wp14:anchorId="0406B0F6" wp14:editId="064E36F4">
+          <wp:inline distT="0" distB="0" distL="0" distR="0" wp14:anchorId="0406B0F6" wp14:editId="25EFFA3D">
             <wp:extent cx="5943600" cy="2742565"/>
             <wp:effectExtent l="0" t="0" r="0" b="0"/>
             <wp:docPr id="1323096203" name="Picture 29"/>
@@ -2181,13 +2226,7 @@
         <w:pStyle w:val="BodyText"/>
       </w:pPr>
       <w:r>
-        <w:t>When creating a new</w:t>
-      </w:r>
-      <w:r>
-        <w:t xml:space="preserve"> piece of</w:t>
-      </w:r>
-      <w:r>
-        <w:t xml:space="preserve"> equipment you must specify the following:</w:t>
+        <w:t>When creating a new piece of equipment you must specify the following:</w:t>
       </w:r>
     </w:p>
     <w:p>
@@ -2299,10 +2338,7 @@
         <w:pStyle w:val="Heading2"/>
       </w:pPr>
       <w:r>
-        <w:t>9</w:t>
-      </w:r>
-      <w:r>
-        <w:t>. Reservation Troubleshooting</w:t>
+        <w:t>9. Reservation Troubleshooting</w:t>
       </w:r>
     </w:p>
     <w:p>

</xml_diff>